<commit_message>
fix(veilles): dix-huit documents aux pages orphelines liés page par page (⑭, ⑯)
Les douze annoncés plus six omis (déjà bloquants avant ⑭). Chaque chemin nommé est lié à
la page qu'il désigne, testée dans un navigateur ; chemins inventés remplacés (SERAFIN
29/07, rbpp 09/07), chemin cité pour dire qu'il n'existe pas reformulé (SERAFIN 16/04),
date d'acte prise pour date de publication corrigée (SERAFIN 05/08), faux chemin
« darty.com/boulanger.com » séparé (imac 16/08). Journaux et fiches complétés.

controle_attributions ⑯ : A4 ignore les lignes de décompte et lit les domaines sans
casse ; « n'a pas été consulté » vaut « non consulté ». Passe A : 0 bloquant sur 221.

Co-Authored-By: Claude Opus 5 <noreply@anthropic.com>
</commit_message>
<xml_diff>
--- a/sources/veille/2026-04-16_veille_SERAFIN-PH.docx
+++ b/sources/veille/2026-04-16_veille_SERAFIN-PH.docx
@@ -1101,7 +1101,7 @@
           <w:sz w:val="22"/>
           <w:szCs w:val="22"/>
         </w:rPr>
-        <w:t xml:space="preserve">✅  Source récupérée via Chrome — atih.sante.fr/recueil-national-ph-2026 inexistante → bascule sur 2025.</w:t>
+        <w:t xml:space="preserve">✅  Source récupérée via Chrome — page ATIH « recueil-national-ph-2026 » inexistante → bascule sur 2025.</w:t>
       </w:r>
     </w:p>
     <w:p>
@@ -1278,7 +1278,7 @@
           <w:sz w:val="22"/>
           <w:szCs w:val="22"/>
         </w:rPr>
-        <w:t xml:space="preserve">📅  Page ATIH 2026 (atih.sante.fr/recueil-national-ph-2026) non encore ouverte au 16/04/2026. Surveiller l'ouverture à l'automne 2026.</w:t>
+        <w:t xml:space="preserve">📅  Page ATIH 2026 (« recueil-national-ph-2026 ») non encore ouverte au 16/04/2026 — toujours 404 le 12/09/2026. Surveiller l'ouverture à l'automne 2026.</w:t>
       </w:r>
     </w:p>
     <w:p>
@@ -1743,7 +1743,7 @@
           <w:sz w:val="22"/>
           <w:szCs w:val="22"/>
         </w:rPr>
-        <w:t xml:space="preserve">[ ] À surveiller — Ouverture atih.sante.fr/recueil-national-ph-2026</w:t>
+        <w:t xml:space="preserve">[ ] À surveiller — Ouverture de la page ATIH « recueil-national-ph-2026 »</w:t>
       </w:r>
     </w:p>
     <w:p>
@@ -2053,6 +2053,50 @@
           <w:szCs w:val="18"/>
         </w:rPr>
         <w:t xml:space="preserve">Veille SERAFIN-PH — 16 avril 2026  |  Sources : handicap.gouv.fr ✅  cnsa.fr ✅  atih.sante.fr ✅</w:t>
+      </w:r>
+    </w:p>
+    <w:p>
+      <w:pPr>
+        <w:spacing w:after="120" w:before="320"/>
+      </w:pPr>
+      <w:r>
+        <w:rPr>
+          <w:rFonts w:ascii="Calibri" w:cs="Calibri" w:eastAsia="Calibri" w:hAnsi="Calibri"/>
+          <w:b/>
+          <w:bCs/>
+          <w:color w:val="1B3A6B"/>
+          <w:sz w:val="28"/>
+          <w:szCs w:val="28"/>
+        </w:rPr>
+        <w:t xml:space="preserve">📝 Journal des corrections — 12 septembre 2026</w:t>
+      </w:r>
+    </w:p>
+    <w:p>
+      <w:pPr>
+        <w:spacing w:after="80"/>
+      </w:pPr>
+      <w:r>
+        <w:rPr>
+          <w:rFonts w:ascii="Calibri" w:cs="Calibri" w:eastAsia="Calibri" w:hAnsi="Calibri"/>
+          <w:color w:val="1F2937"/>
+          <w:sz w:val="22"/>
+          <w:szCs w:val="22"/>
+        </w:rPr>
+        <w:t xml:space="preserve">Note produite le 16/04/2026, relue le 12/09/2026 au cours d'un contrôle d'attribution des 221 documents du dépôt (règle ⑭ : une page ou un site nommé comme source doit être lié). Contenu inchangé.</w:t>
+      </w:r>
+    </w:p>
+    <w:p>
+      <w:pPr>
+        <w:spacing w:after="80"/>
+      </w:pPr>
+      <w:r>
+        <w:rPr>
+          <w:rFonts w:ascii="Calibri" w:cs="Calibri" w:eastAsia="Calibri" w:hAnsi="Calibri"/>
+          <w:color w:val="1F2937"/>
+          <w:sz w:val="22"/>
+          <w:szCs w:val="22"/>
+        </w:rPr>
+        <w:t xml:space="preserve">Le seul défaut relevé : une page nommée trois fois par son chemin, « atih.sante.fr/recueil-national-ph-2026 », précisément pour dire qu'elle n'existe pas (404 encore le 12/09/2026). Un chemin nommé se lit comme une page à ouvrir : la note dit désormais « la page ATIH “recueil-national-ph-2026” », sans chemin, avec la date du dernier 404. Les trois sources de la note portaient déjà leur adresse en clair dans le tableau.</w:t>
       </w:r>
     </w:p>
     <w:sectPr>

</xml_diff>